<commit_message>
Finalize supplementary legend formatting
</commit_message>
<xml_diff>
--- a/05_Manuscript/Manuscript_R1_clean.docx
+++ b/05_Manuscript/Manuscript_R1_clean.docx
@@ -18781,7 +18781,7 @@
           <w:b w:val="0"/>
           <w:szCs w:val="24"/>
         </w:rPr>
-        <w:t xml:space="preserve"> data. (A) UMAP embeddings colored by genes detected, total UMI counts, mitochondrial percentage, and doublet score. (B, C) QC metrics across the 32 stomach samples, colored by treatment–response group (B; grey, not selected for the response comparisons), and across the 38 non-stomach samples, colored by tissue site (C). (D) UMAP colored by sample identity before and after Harmony batch correction. (E) Scrublet doublet scores across all cells.</w:t>
+        <w:t xml:space="preserve"> data.</w:t>
       </w:r>
     </w:p>
     <w:p>
@@ -18808,7 +18808,7 @@
           <w:bCs/>
           <w:szCs w:val="24"/>
         </w:rPr>
-        <w:t xml:space="preserve">Cell type annotation. (A, B) Canonical marker genes across the 12 major cell types with T/NK merged (A), and across the T/NK subtypes (B). Dot size, fraction of expressing cells; color, mean expression scaled within each gene; the key beside (B) applies to both panels. (C) Cell-type composition of the 38 non-stomach samples. Color mapping matches Figure 1C.</w:t>
+        <w:t xml:space="preserve">Cell type annotation.</w:t>
       </w:r>
     </w:p>
     <w:p>
@@ -18860,7 +18860,7 @@
           <w:b w:val="0"/>
           <w:szCs w:val="24"/>
         </w:rPr>
-        <w:t xml:space="preserve"> characterization. (A) Dotplot of marker genes across 9 epithelial sub-clusters. (B) Spearman correlation between CEACAM5 and CEACAM6 in an independent cohort (PRJEB25780; BayesPrism-deconvolved epithelial expression; NR, n = 33; R, n = 12), colored by R versus NR. (C) Spearman correlation between CEACAM5 and CEACAM6 in TCGA-STAD (n = 410; BayesPrism-deconvolved epithelial expression). (D) Proportion of CEACAM5/6-high (Epi_CEACAM5/6</w:t>
+        <w:t xml:space="preserve"> characterization.</w:t>
       </w:r>
       <w:r>
         <w:rPr>
@@ -18869,15 +18869,15 @@
           <w:szCs w:val="24"/>
           <w:vertAlign w:val="superscript"/>
         </w:rPr>
-        <w:t xml:space="preserve">+</w:t>
-      </w:r>
-      <w:r>
-        <w:rPr>
-          <w:rFonts w:eastAsia="Times New Roman" w:cs="Times New Roman"/>
-          <w:b w:val="0"/>
-          <w:szCs w:val="24"/>
-        </w:rPr>
-        <w:t xml:space="preserve">) epithelial cells in primary tumor samples after adjusting for tumor content (residuals of the per-sample proportion regressed on the mean tumor score), R versus NR (n = 4 per group). Mann–Whitney U test. (E) Proportion of CEACAM5/6-high (Epi_CEACAM5/6</w:t>
+        <w:t xml:space="preserve"/>
+      </w:r>
+      <w:r>
+        <w:rPr>
+          <w:rFonts w:eastAsia="Times New Roman" w:cs="Times New Roman"/>
+          <w:b w:val="0"/>
+          <w:szCs w:val="24"/>
+        </w:rPr>
+        <w:t xml:space="preserve"/>
       </w:r>
       <w:r>
         <w:rPr>
@@ -18886,15 +18886,15 @@
           <w:szCs w:val="24"/>
           <w:vertAlign w:val="superscript"/>
         </w:rPr>
-        <w:t xml:space="preserve">+</w:t>
-      </w:r>
-      <w:r>
-        <w:rPr>
-          <w:rFonts w:eastAsia="Times New Roman" w:cs="Times New Roman"/>
-          <w:b w:val="0"/>
-          <w:szCs w:val="24"/>
-        </w:rPr>
-        <w:t xml:space="preserve">) epithelial cells in liver metastasis samples, R versus NR. Mann–Whitney U test. (F) Gene signature heatmap of the 5 NMF meta-programs (S-MP1–S-MP5), showing the top 10 genes per program. (G) Jaccard similarity heatmap of the per-sample NMF programs (n = 116) across all gastric tumor samples, grouped into meta-programs MP1–MP5. (H) Kaplan–Meier overall survival curves for CEACAM5 (left) and CEACAM6 (right) deconvolved epithelial expression, high versus low, in TCGA-STAD (median split, n = 183 per group). Log-rank test.</w:t>
+        <w:t xml:space="preserve"/>
+      </w:r>
+      <w:r>
+        <w:rPr>
+          <w:rFonts w:eastAsia="Times New Roman" w:cs="Times New Roman"/>
+          <w:b w:val="0"/>
+          <w:szCs w:val="24"/>
+        </w:rPr>
+        <w:t xml:space="preserve"/>
       </w:r>
     </w:p>
     <w:p>
@@ -18979,7 +18979,7 @@
           <w:b w:val="0"/>
           <w:szCs w:val="24"/>
         </w:rPr>
-        <w:t xml:space="preserve"> adaptive lineage composition. (A) Dotplot of marker genes across 8 CD8</w:t>
+        <w:t xml:space="preserve"> adaptive lineage composition.</w:t>
       </w:r>
       <w:r>
         <w:rPr>
@@ -18988,15 +18988,15 @@
           <w:szCs w:val="24"/>
           <w:vertAlign w:val="superscript"/>
         </w:rPr>
-        <w:t xml:space="preserve">+</w:t>
-      </w:r>
-      <w:r>
-        <w:rPr>
-          <w:rFonts w:eastAsia="Times New Roman" w:cs="Times New Roman"/>
-          <w:b w:val="0"/>
-          <w:szCs w:val="24"/>
-        </w:rPr>
-        <w:t xml:space="preserve"> T cell sub-clusters. Dot size, percentage of expressing cells; color, mean expression. (B) UMAP of CD8</w:t>
+        <w:t xml:space="preserve"/>
+      </w:r>
+      <w:r>
+        <w:rPr>
+          <w:rFonts w:eastAsia="Times New Roman" w:cs="Times New Roman"/>
+          <w:b w:val="0"/>
+          <w:szCs w:val="24"/>
+        </w:rPr>
+        <w:t xml:space="preserve"/>
       </w:r>
       <w:r>
         <w:rPr>
@@ -19005,15 +19005,15 @@
           <w:szCs w:val="24"/>
           <w:vertAlign w:val="superscript"/>
         </w:rPr>
-        <w:t xml:space="preserve">+</w:t>
-      </w:r>
-      <w:r>
-        <w:rPr>
-          <w:rFonts w:eastAsia="Times New Roman" w:cs="Times New Roman"/>
-          <w:b w:val="0"/>
-          <w:szCs w:val="24"/>
-        </w:rPr>
-        <w:t xml:space="preserve"> T cells colored by PDCD1 (PD-1) expression (log-normalized). (C) UMAP of CD8</w:t>
+        <w:t xml:space="preserve"/>
+      </w:r>
+      <w:r>
+        <w:rPr>
+          <w:rFonts w:eastAsia="Times New Roman" w:cs="Times New Roman"/>
+          <w:b w:val="0"/>
+          <w:szCs w:val="24"/>
+        </w:rPr>
+        <w:t xml:space="preserve"/>
       </w:r>
       <w:r>
         <w:rPr>
@@ -19022,15 +19022,15 @@
           <w:szCs w:val="24"/>
           <w:vertAlign w:val="superscript"/>
         </w:rPr>
-        <w:t xml:space="preserve">+</w:t>
-      </w:r>
-      <w:r>
-        <w:rPr>
-          <w:rFonts w:eastAsia="Times New Roman" w:cs="Times New Roman"/>
-          <w:b w:val="0"/>
-          <w:szCs w:val="24"/>
-        </w:rPr>
-        <w:t xml:space="preserve"> T cells colored by HAVCR2 (TIM-3) expression (log-normalized). (D) UMAP of CD8</w:t>
+        <w:t xml:space="preserve"/>
+      </w:r>
+      <w:r>
+        <w:rPr>
+          <w:rFonts w:eastAsia="Times New Roman" w:cs="Times New Roman"/>
+          <w:b w:val="0"/>
+          <w:szCs w:val="24"/>
+        </w:rPr>
+        <w:t xml:space="preserve"/>
       </w:r>
       <w:r>
         <w:rPr>
@@ -19039,47 +19039,47 @@
           <w:szCs w:val="24"/>
           <w:vertAlign w:val="superscript"/>
         </w:rPr>
-        <w:t xml:space="preserve">+</w:t>
-      </w:r>
-      <w:r>
-        <w:rPr>
-          <w:rFonts w:eastAsia="Times New Roman" w:cs="Times New Roman"/>
-          <w:b w:val="0"/>
-          <w:szCs w:val="24"/>
-        </w:rPr>
-        <w:t xml:space="preserve"> T cells colored by the composite</w:t>
-      </w:r>
-      <w:r>
-        <w:rPr>
-          <w:rFonts w:eastAsia="Times New Roman" w:cs="Times New Roman"/>
-          <w:b w:val="0"/>
-          <w:szCs w:val="24"/>
-        </w:rPr>
-        <w:t xml:space="preserve"> exhaustion</w:t>
-      </w:r>
-      <w:r>
-        <w:rPr>
-          <w:rFonts w:eastAsia="Times New Roman" w:cs="Times New Roman"/>
-          <w:b w:val="0"/>
-          <w:szCs w:val="24"/>
-        </w:rPr>
-        <w:t xml:space="preserve"> (Tex) score used to annotate the exhausted state (</w:t>
-      </w:r>
-      <w:r>
-        <w:rPr>
-          <w:rFonts w:eastAsia="Times New Roman" w:cs="Times New Roman"/>
-          <w:b/>
-          <w:szCs w:val="24"/>
-        </w:rPr>
-        <w:t xml:space="preserve">Table S3</w:t>
-      </w:r>
-      <w:r>
-        <w:rPr>
-          <w:rFonts w:eastAsia="Times New Roman" w:cs="Times New Roman"/>
-          <w:b w:val="0"/>
-          <w:szCs w:val="24"/>
-        </w:rPr>
-        <w:t xml:space="preserve">; see Methods). (E) Minor-state composition of the CD4</w:t>
+        <w:t xml:space="preserve"/>
+      </w:r>
+      <w:r>
+        <w:rPr>
+          <w:rFonts w:eastAsia="Times New Roman" w:cs="Times New Roman"/>
+          <w:b w:val="0"/>
+          <w:szCs w:val="24"/>
+        </w:rPr>
+        <w:t xml:space="preserve"/>
+      </w:r>
+      <w:r>
+        <w:rPr>
+          <w:rFonts w:eastAsia="Times New Roman" w:cs="Times New Roman"/>
+          <w:b w:val="0"/>
+          <w:szCs w:val="24"/>
+        </w:rPr>
+        <w:t xml:space="preserve"/>
+      </w:r>
+      <w:r>
+        <w:rPr>
+          <w:rFonts w:eastAsia="Times New Roman" w:cs="Times New Roman"/>
+          <w:b w:val="0"/>
+          <w:szCs w:val="24"/>
+        </w:rPr>
+        <w:t xml:space="preserve"/>
+      </w:r>
+      <w:r>
+        <w:rPr>
+          <w:rFonts w:eastAsia="Times New Roman" w:cs="Times New Roman"/>
+          <w:b/>
+          <w:szCs w:val="24"/>
+        </w:rPr>
+        <w:t xml:space="preserve"/>
+      </w:r>
+      <w:r>
+        <w:rPr>
+          <w:rFonts w:eastAsia="Times New Roman" w:cs="Times New Roman"/>
+          <w:b w:val="0"/>
+          <w:szCs w:val="24"/>
+        </w:rPr>
+        <w:t xml:space="preserve"/>
       </w:r>
       <w:r>
         <w:rPr>
@@ -19088,15 +19088,15 @@
           <w:szCs w:val="24"/>
           <w:vertAlign w:val="superscript"/>
         </w:rPr>
-        <w:t xml:space="preserve">+</w:t>
-      </w:r>
-      <w:r>
-        <w:rPr>
-          <w:rFonts w:eastAsia="Times New Roman" w:cs="Times New Roman"/>
-          <w:b w:val="0"/>
-          <w:szCs w:val="24"/>
-        </w:rPr>
-        <w:t xml:space="preserve"> T, CD8</w:t>
+        <w:t xml:space="preserve"/>
+      </w:r>
+      <w:r>
+        <w:rPr>
+          <w:rFonts w:eastAsia="Times New Roman" w:cs="Times New Roman"/>
+          <w:b w:val="0"/>
+          <w:szCs w:val="24"/>
+        </w:rPr>
+        <w:t xml:space="preserve"/>
       </w:r>
       <w:r>
         <w:rPr>
@@ -19105,15 +19105,15 @@
           <w:szCs w:val="24"/>
           <w:vertAlign w:val="superscript"/>
         </w:rPr>
-        <w:t xml:space="preserve">+</w:t>
-      </w:r>
-      <w:r>
-        <w:rPr>
-          <w:rFonts w:eastAsia="Times New Roman" w:cs="Times New Roman"/>
-          <w:b w:val="0"/>
-          <w:szCs w:val="24"/>
-        </w:rPr>
-        <w:t xml:space="preserve"> T, NK and B cell compartments across treatment–response groups.</w:t>
+        <w:t xml:space="preserve"/>
+      </w:r>
+      <w:r>
+        <w:rPr>
+          <w:rFonts w:eastAsia="Times New Roman" w:cs="Times New Roman"/>
+          <w:b w:val="0"/>
+          <w:szCs w:val="24"/>
+        </w:rPr>
+        <w:t xml:space="preserve"/>
       </w:r>
     </w:p>
     <w:p>
@@ -19167,23 +19167,23 @@
           <w:b w:val="0"/>
           <w:szCs w:val="24"/>
         </w:rPr>
-        <w:t xml:space="preserve"> samples. (A–E) Spatial maps across all 10 gastric cancer</w:t>
-      </w:r>
-      <w:r>
-        <w:rPr>
-          <w:rFonts w:eastAsia="Times New Roman" w:cs="Times New Roman"/>
-          <w:b w:val="0"/>
-          <w:szCs w:val="24"/>
-        </w:rPr>
-        <w:t xml:space="preserve"> samples</w:t>
-      </w:r>
-      <w:r>
-        <w:rPr>
-          <w:rFonts w:eastAsia="Times New Roman" w:cs="Times New Roman"/>
-          <w:b w:val="0"/>
-          <w:szCs w:val="24"/>
-        </w:rPr>
-        <w:t xml:space="preserve"> showing: (A) CEACAM ratio (proportion of CEACAM5/6-high epithelial cells among total epithelial cells per spot, GraphST deconvolution), (B) deconvolved monocyte/macrophage fraction, (C) total epithelial fraction, (D) distance to the nearest stromal region, and (E) distance to the nearest immune region. (F) Stacked bar chart of deconvolved cell type proportions per sample (GraphST). Color mapping matches Figure 1C.</w:t>
+        <w:t xml:space="preserve"> samples.</w:t>
+      </w:r>
+      <w:r>
+        <w:rPr>
+          <w:rFonts w:eastAsia="Times New Roman" w:cs="Times New Roman"/>
+          <w:b w:val="0"/>
+          <w:szCs w:val="24"/>
+        </w:rPr>
+        <w:t xml:space="preserve"/>
+      </w:r>
+      <w:r>
+        <w:rPr>
+          <w:rFonts w:eastAsia="Times New Roman" w:cs="Times New Roman"/>
+          <w:b w:val="0"/>
+          <w:szCs w:val="24"/>
+        </w:rPr>
+        <w:t xml:space="preserve"/>
       </w:r>
     </w:p>
     <w:p>
@@ -19235,7 +19235,7 @@
           <w:b w:val="0"/>
           <w:szCs w:val="24"/>
         </w:rPr>
-        <w:t xml:space="preserve"> groups. (A–E) Immune module proportions in pre-treatment and post-treatment stomach samples. Left, pre-treatment R (n = 4) versus NR (n = 4); right, post-treatment R (n = 5) versus NR (n = 6). IM-T/NK/DC (A), IM-MoMac (B), IM-Mixed (C), IM-Neutrophil (D), IM-B/Plasma (E). Two-sided Mann–Whitney U test; exact P values shown (*, P &lt; 0.05). Boxes show the median and interquartile range; whiskers extend to 1.5 × the interquartile range and open circles mark values beyond them.</w:t>
+        <w:t xml:space="preserve"> groups.</w:t>
       </w:r>
     </w:p>
     <w:p>
@@ -19287,23 +19287,23 @@
           <w:b w:val="0"/>
           <w:szCs w:val="24"/>
         </w:rPr>
-        <w:t xml:space="preserve"> samples. (A–I) Sample-level CD274 (PD-L1) expression in post-treatment R versus NR</w:t>
-      </w:r>
-      <w:r>
-        <w:rPr>
-          <w:rFonts w:eastAsia="Times New Roman" w:cs="Times New Roman"/>
-          <w:b w:val="0"/>
-          <w:szCs w:val="24"/>
-        </w:rPr>
-        <w:t xml:space="preserve"> samples</w:t>
-      </w:r>
-      <w:r>
-        <w:rPr>
-          <w:rFonts w:eastAsia="Times New Roman" w:cs="Times New Roman"/>
-          <w:b w:val="0"/>
-          <w:szCs w:val="24"/>
-        </w:rPr>
-        <w:t xml:space="preserve"> for cell types not shown in Figure 5: CD8</w:t>
+        <w:t xml:space="preserve"> samples.</w:t>
+      </w:r>
+      <w:r>
+        <w:rPr>
+          <w:rFonts w:eastAsia="Times New Roman" w:cs="Times New Roman"/>
+          <w:b w:val="0"/>
+          <w:szCs w:val="24"/>
+        </w:rPr>
+        <w:t xml:space="preserve"/>
+      </w:r>
+      <w:r>
+        <w:rPr>
+          <w:rFonts w:eastAsia="Times New Roman" w:cs="Times New Roman"/>
+          <w:b w:val="0"/>
+          <w:szCs w:val="24"/>
+        </w:rPr>
+        <w:t xml:space="preserve"/>
       </w:r>
       <w:r>
         <w:rPr>
@@ -19312,15 +19312,15 @@
           <w:szCs w:val="24"/>
           <w:vertAlign w:val="superscript"/>
         </w:rPr>
-        <w:t xml:space="preserve">+</w:t>
-      </w:r>
-      <w:r>
-        <w:rPr>
-          <w:rFonts w:eastAsia="Times New Roman" w:cs="Times New Roman"/>
-          <w:b w:val="0"/>
-          <w:szCs w:val="24"/>
-        </w:rPr>
-        <w:t xml:space="preserve"> T cells (A), CD4</w:t>
+        <w:t xml:space="preserve"/>
+      </w:r>
+      <w:r>
+        <w:rPr>
+          <w:rFonts w:eastAsia="Times New Roman" w:cs="Times New Roman"/>
+          <w:b w:val="0"/>
+          <w:szCs w:val="24"/>
+        </w:rPr>
+        <w:t xml:space="preserve"/>
       </w:r>
       <w:r>
         <w:rPr>
@@ -19329,15 +19329,15 @@
           <w:szCs w:val="24"/>
           <w:vertAlign w:val="superscript"/>
         </w:rPr>
-        <w:t xml:space="preserve">+</w:t>
-      </w:r>
-      <w:r>
-        <w:rPr>
-          <w:rFonts w:eastAsia="Times New Roman" w:cs="Times New Roman"/>
-          <w:b w:val="0"/>
-          <w:szCs w:val="24"/>
-        </w:rPr>
-        <w:t xml:space="preserve"> T cells (B), NK cells (C), B cells (D), Plasma cells (E), Mast cells (F), Neutrophils (G), Endothelial cells (H), and Pericytes (I). Of the 5 R and 6 NR samples, those with fewer than 20 cells of a given type were excluded; the n per group is printed under each panel. Two-sided Mann–Whitney U test; exact P values shown (*, P &lt; 0.05). Boxes show the median and interquartile range; whiskers extend to 1.5 × the interquartile range and open circles mark values beyond them.</w:t>
+        <w:t xml:space="preserve"/>
+      </w:r>
+      <w:r>
+        <w:rPr>
+          <w:rFonts w:eastAsia="Times New Roman" w:cs="Times New Roman"/>
+          <w:b w:val="0"/>
+          <w:szCs w:val="24"/>
+        </w:rPr>
+        <w:t xml:space="preserve"/>
       </w:r>
     </w:p>
     <w:p>
@@ -19364,25 +19364,25 @@
           <w:bCs/>
           <w:szCs w:val="24"/>
         </w:rPr>
-        <w:t xml:space="preserve">Epithelial metaprograms and CEACAM5 compared with CEACAM6. (A) S-MP4 and S-MP5 scores in each of the four treatment–response groups, with the pre-treatment and post-treatment responder versus non-responder contrasts and the pre- versus post-treatment contrast within responders and within non-responders. Two-sided Mann–Whitney U test; exact P values shown. (B) Percentage of pre-treatment epithelial cells that are CEACAM5-positive only, CEACAM6-positive only, double-positive or double-negative, in responders (n = 4) and non-responders (n = 4). Two-sided Mann–Whitney U test on per-sample fractions. (C) Immunohistochemical staining reported separately for CEACAM5 and for CEACAM6, with the summed score of </w:t>
-      </w:r>
-      <w:r>
-        <w:rPr>
-          <w:rFonts w:eastAsia="Times New Roman" w:cs="Times New Roman"/>
-          <w:b/>
-          <w:bCs/>
-          <w:szCs w:val="24"/>
-        </w:rPr>
-        <w:t xml:space="preserve">Fig. 2N</w:t>
-      </w:r>
-      <w:r>
-        <w:rPr>
-          <w:rFonts w:eastAsia="Times New Roman" w:cs="Times New Roman"/>
-          <w:b w:val="0"/>
-          <w:bCs/>
-          <w:szCs w:val="24"/>
-        </w:rPr>
-        <w:t xml:space="preserve"> alongside (n = 4 per group). Two-sided Mann–Whitney U test. Boxes show the median and interquartile range; whiskers extend to 1.5 × the interquartile range and open circles mark values beyond them.</w:t>
+        <w:t xml:space="preserve">Epithelial metaprograms and CEACAM5 compared with CEACAM6.</w:t>
+      </w:r>
+      <w:r>
+        <w:rPr>
+          <w:rFonts w:eastAsia="Times New Roman" w:cs="Times New Roman"/>
+          <w:b/>
+          <w:bCs/>
+          <w:szCs w:val="24"/>
+        </w:rPr>
+        <w:t xml:space="preserve"/>
+      </w:r>
+      <w:r>
+        <w:rPr>
+          <w:rFonts w:eastAsia="Times New Roman" w:cs="Times New Roman"/>
+          <w:b w:val="0"/>
+          <w:bCs/>
+          <w:szCs w:val="24"/>
+        </w:rPr>
+        <w:t xml:space="preserve"/>
       </w:r>
     </w:p>
     <w:p>
@@ -19409,7 +19409,7 @@
           <w:bCs/>
           <w:szCs w:val="24"/>
         </w:rPr>
-        <w:t xml:space="preserve">Density-stratified spatial analyses and independent bulk validation. (A, B) CEACAM-ratio coefficients from section-level models of standardized distance to immune-rich regions (A) and stroma (B), within low, medium and high local epithelial-density tertiles. Points show individual sections; horizontal bars show the mean and vertical bars the 95% confidence interval. Two-sided Wilcoxon signed-rank significance annotations are shown. (C) A representative spatial section, selected by the cohort-median rule described in Methods, with CEACAM-high and CEACAM-low rows and density tertiles in columns. Lines join sampled spots to their five nearest other immune-rich spots; labels report the median distance and number of eligible spots in each group. (D) ESTIMATE immune score against BayesPrism-deconvolved epithelial CEACAM5/6 in the 395 TCGA-STAD tumors with an ABSOLUTE purity call, with the ordinary least-squares fit and the purity-adjusted P value. (E) The change in immune score per log2 unit of epithelial CEACAM after adjustment for ABSOLUTE DNA-based tumor purity, for the CEACAM5/6 mean and for each gene separately, with 95% confidence interval. (D) and (E) show the immune score; the ESTIMATE stromal score, modeled the same way, moved in the same direction (β = −75.6 per log2 unit, P = 4.3 × 10⁻¹¹), concordantly for CEACAM5 and CEACAM6 separately.</w:t>
+        <w:t xml:space="preserve">Density-stratified spatial analyses and independent bulk validation.</w:t>
       </w:r>
     </w:p>
     <w:p>
@@ -19436,7 +19436,7 @@
           <w:bCs/>
           <w:szCs w:val="24"/>
         </w:rPr>
-        <w:t xml:space="preserve">Monocyte/macrophage identity and the specificity of the NF-κB signature. (A) Macrophage against monocyte signature score for each of the seven monocyte/macrophage states, averaged over the cells of the state; the IL-1β</w:t>
+        <w:t xml:space="preserve">Monocyte/macrophage identity and the specificity of the NF-κB signature.</w:t>
       </w:r>
       <w:r>
         <w:rPr>
@@ -19446,16 +19446,16 @@
           <w:szCs w:val="24"/>
           <w:vertAlign w:val="superscript"/>
         </w:rPr>
-        <w:t xml:space="preserve">+</w:t>
-      </w:r>
-      <w:r>
-        <w:rPr>
-          <w:rFonts w:eastAsia="Times New Roman" w:cs="Times New Roman"/>
-          <w:b w:val="0"/>
-          <w:bCs/>
-          <w:szCs w:val="24"/>
-        </w:rPr>
-        <w:t xml:space="preserve"> MoMac state is highlighted and the diagonal marks equal scores. (B) Expression of the monocyte and macrophage marker panels, labeled on the axis, across the same states. Dot size, percentage of expressing cells; color, mean expression scaled within each gene. (C) Normalized enrichment score of Hallmark TNFα signaling via NF-κB in post-treatment non-responders versus responders for each of the 13 cell types, with the FDR and the rank of the set among all Hallmark sets tested in that cell type printed beside each bar; bars are colored by FDR q &lt; 0.25. (D) Mean expression of IL1A, IL1B, IL6, TNF and CXCL8 in epithelial cells and in monocytes/macrophages of the post-treatment non-responder samples, on a symmetric log scale. (E) NFKB1 regulon activity (pySCENIC AUCell, sample means) in monocytes/macrophages of post-treatment responders (n = 5) and non-responders (n = 6). Two-sided Mann–Whitney U test. Boxes show the median and interquartile range; whiskers extend to 1.5 × the interquartile range and open circles mark values beyond them. BACH1 was analyzed in the same way.</w:t>
+        <w:t xml:space="preserve"/>
+      </w:r>
+      <w:r>
+        <w:rPr>
+          <w:rFonts w:eastAsia="Times New Roman" w:cs="Times New Roman"/>
+          <w:b w:val="0"/>
+          <w:bCs/>
+          <w:szCs w:val="24"/>
+        </w:rPr>
+        <w:t xml:space="preserve"/>
       </w:r>
     </w:p>
     <w:p>

</xml_diff>